<commit_message>
docs: expand gym management report
Co-authored-by: Copilot <223556219+Copilot@users.noreply.github.com>
</commit_message>
<xml_diff>
--- a/Raporti_Teknik_1_Gym_Management_Fatlind_Hamza.docx
+++ b/Raporti_Teknik_1_Gym_Management_Fatlind_Hamza.docx
@@ -560,14 +560,8 @@
             <w:vAlign w:val="center"/>
           </w:tcPr>
           <w:p>
-            <w:pPr>
-              <w:spacing w:after="20"/>
-            </w:pPr>
-            <w:r>
-              <w:rPr>
-                <w:sz w:val="18"/>
-              </w:rPr>
-              <w:t>Në versionin fillestar, të dhënat e tij menaxhohen nga stafi; portal personal mund të shtohet më vonë.</w:t>
+            <w:r>
+              <w:t>Në fazën e parë menaxhohet nga stafi; në fazën e zgjeruar kyçet në aplikacionin mobil dhe sheh abonimin, pagesat dhe hyrjet e veta.</w:t>
             </w:r>
           </w:p>
         </w:tc>
@@ -689,7 +683,7 @@
         <w:pStyle w:val="Heading2"/>
       </w:pPr>
       <w:r>
-        <w:t>3.3 Jashtë scope-it për këtë semestër</w:t>
+        <w:t>3.3 Jashtë scope-it të fazës fillestare të semestrit (të planifikuara për fazat pasuese)</w:t>
       </w:r>
     </w:p>
     <w:p>
@@ -697,7 +691,7 @@
         <w:pStyle w:val="ListBullet"/>
       </w:pPr>
       <w:r>
-        <w:t>Integrimi me pajisje fizike të hyrjes ose karta RFID.</w:t>
+        <w:t>Integrimi me pajisje fizike të hyrjes ose karta RFID; fillimisht hyrja verifikohet nga stafi me skanim QR dhe konfirmim online nga serveri.</w:t>
       </w:r>
     </w:p>
     <w:p>
@@ -713,7 +707,7 @@
         <w:pStyle w:val="ListBullet"/>
       </w:pPr>
       <w:r>
-        <w:t>Aplikacion mobil i veçantë.</w:t>
+        <w:t>Aplikacioni mobil React Native dhe verifikimi i hyrjeve me QR nuk implementohen në fazën fillestare; planifikohen si faza pasuese të projektit.</w:t>
       </w:r>
     </w:p>
     <w:p>
@@ -2975,12 +2969,203 @@
           </w:p>
         </w:tc>
       </w:tr>
+      <w:tr>
+        <w:tc>
+          <w:tcPr>
+            <w:tcW w:type="dxa" w:w="3264"/>
+          </w:tcPr>
+          <w:p>
+            <w:r>
+              <w:t>Webfaqja publike dhe paneli</w:t>
+            </w:r>
+          </w:p>
+        </w:tc>
+        <w:tc>
+          <w:tcPr>
+            <w:tcW w:type="dxa" w:w="3264"/>
+          </w:tcPr>
+          <w:p>
+            <w:r>
+              <w:t>PHP 8.x, HTML5, CSS3, JavaScript, Bootstrap 5</w:t>
+            </w:r>
+          </w:p>
+        </w:tc>
+        <w:tc>
+          <w:tcPr>
+            <w:tcW w:type="dxa" w:w="3264"/>
+          </w:tcPr>
+          <w:p>
+            <w:r>
+              <w:t>Faqja publike prezanton palestrën; paneli i mbrojtur përdoret nga administratori dhe stafi.</w:t>
+            </w:r>
+          </w:p>
+        </w:tc>
+      </w:tr>
+      <w:tr>
+        <w:tc>
+          <w:tcPr>
+            <w:tcW w:type="dxa" w:w="3264"/>
+          </w:tcPr>
+          <w:p>
+            <w:r>
+              <w:t>API për aplikacionin</w:t>
+            </w:r>
+          </w:p>
+        </w:tc>
+        <w:tc>
+          <w:tcPr>
+            <w:tcW w:type="dxa" w:w="3264"/>
+          </w:tcPr>
+          <w:p>
+            <w:r>
+              <w:t>PHP 8.x, REST, JSON, PDO</w:t>
+            </w:r>
+          </w:p>
+        </w:tc>
+        <w:tc>
+          <w:tcPr>
+            <w:tcW w:type="dxa" w:w="3264"/>
+          </w:tcPr>
+          <w:p>
+            <w:r>
+              <w:t>API e vetme zbaton rregullat e biznesit, autentikimin dhe autorizimin; përdoret nga React Native.</w:t>
+            </w:r>
+          </w:p>
+        </w:tc>
+      </w:tr>
+      <w:tr>
+        <w:tc>
+          <w:tcPr>
+            <w:tcW w:type="dxa" w:w="3264"/>
+          </w:tcPr>
+          <w:p>
+            <w:r>
+              <w:t>Aplikacioni mobil</w:t>
+            </w:r>
+          </w:p>
+        </w:tc>
+        <w:tc>
+          <w:tcPr>
+            <w:tcW w:type="dxa" w:w="3264"/>
+          </w:tcPr>
+          <w:p>
+            <w:r>
+              <w:t>React Native, JavaScript ose TypeScript</w:t>
+            </w:r>
+          </w:p>
+        </w:tc>
+        <w:tc>
+          <w:tcPr>
+            <w:tcW w:type="dxa" w:w="3264"/>
+          </w:tcPr>
+          <w:p>
+            <w:r>
+              <w:t>Aplikacion ndër-platformor për Android/iOS; shfaq vetëm të dhënat e anëtarit të kyçur.</w:t>
+            </w:r>
+          </w:p>
+        </w:tc>
+      </w:tr>
+      <w:tr>
+        <w:tc>
+          <w:tcPr>
+            <w:tcW w:type="dxa" w:w="3264"/>
+          </w:tcPr>
+          <w:p>
+            <w:r>
+              <w:t>Autentikimi mobil</w:t>
+            </w:r>
+          </w:p>
+        </w:tc>
+        <w:tc>
+          <w:tcPr>
+            <w:tcW w:type="dxa" w:w="3264"/>
+          </w:tcPr>
+          <w:p>
+            <w:r>
+              <w:t>Token qasjeje me skadim dhe token rifreskimi të revokueshëm</w:t>
+            </w:r>
+          </w:p>
+        </w:tc>
+        <w:tc>
+          <w:tcPr>
+            <w:tcW w:type="dxa" w:w="3264"/>
+          </w:tcPr>
+          <w:p>
+            <w:r>
+              <w:t>Lejon sesion mobil pa ruajtur fjalëkalimin në pajisje; kërkon HTTPS dhe kontroll të roleve në server.</w:t>
+            </w:r>
+          </w:p>
+        </w:tc>
+      </w:tr>
+      <w:tr>
+        <w:tc>
+          <w:tcPr>
+            <w:tcW w:type="dxa" w:w="3264"/>
+          </w:tcPr>
+          <w:p>
+            <w:r>
+              <w:t>QR dhe skanimi</w:t>
+            </w:r>
+          </w:p>
+        </w:tc>
+        <w:tc>
+          <w:tcPr>
+            <w:tcW w:type="dxa" w:w="3264"/>
+          </w:tcPr>
+          <w:p>
+            <w:r>
+              <w:t>QR me token të rastësishëm, afatshkurtër dhe njëpërdorimësh; kamerë telefoni</w:t>
+            </w:r>
+          </w:p>
+        </w:tc>
+        <w:tc>
+          <w:tcPr>
+            <w:tcW w:type="dxa" w:w="3264"/>
+          </w:tcPr>
+          <w:p>
+            <w:r>
+              <w:t>Kodi nuk përmban të dhëna personale/ID statike; stafi e skanon dhe serveri vendos nëse lejohet hyrja.</w:t>
+            </w:r>
+          </w:p>
+        </w:tc>
+      </w:tr>
+      <w:tr>
+        <w:tc>
+          <w:tcPr>
+            <w:tcW w:type="dxa" w:w="3264"/>
+          </w:tcPr>
+          <w:p>
+            <w:r>
+              <w:t>Mjedisi testues</w:t>
+            </w:r>
+          </w:p>
+        </w:tc>
+        <w:tc>
+          <w:tcPr>
+            <w:tcW w:type="dxa" w:w="3264"/>
+          </w:tcPr>
+          <w:p>
+            <w:r>
+              <w:t>Instancë testuese dhe databazë me llogari provuese</w:t>
+            </w:r>
+          </w:p>
+        </w:tc>
+        <w:tc>
+          <w:tcPr>
+            <w:tcW w:type="dxa" w:w="3264"/>
+          </w:tcPr>
+          <w:p>
+            <w:r>
+              <w:t>Mundëson demonstrim për përdoruesit testues pa ndikuar në anëtarësimet apo hyrjet reale.</w:t>
+            </w:r>
+          </w:p>
+        </w:tc>
+      </w:tr>
     </w:tbl>
     <w:p/>
     <w:p>
       <w:r>
-        <w:lastRenderedPageBreak/>
-        <w:t>Ky është stack-u i propozuar për projektin dhe mund të përshtatet me kërkesat e lëndës. Përdorimi i PHP/MySQL e bën projektin të realizueshëm në mjedis lokal pa shërbime të paguara.</w:t>
+        <w:t>Ky është stack-u i propozuar për fazën e parë dhe zgjerimin e planifikuar. Webi zhvillohet me PHP/MySQL; aplikacioni React Native përdor API-në e PHP-së dhe nuk lidhet drejtpërdrejt me databazën.</w:t>
       </w:r>
     </w:p>
     <w:p>
@@ -2993,7 +3178,7 @@
     </w:p>
     <w:p>
       <w:r>
-        <w:t>Sistemi do të përdorë arkitekturë me tri shtresa. Shfletuesi paraqet ndërfaqen, backend-i PHP zbaton rregullat e biznesit dhe kontrollon qasjen, ndërsa MySQL ruan të dhënat.</w:t>
+        <w:t>Sistemi do të përdorë arkitekturë me tri shtresa. Webfaqja publike dhe paneli i stafit paraqiten në shfletues; backend-i PHP zbaton rregullat e biznesit dhe ekspozon API REST/JSON për aplikacionin React Native; MySQL ruan të dhënat e përbashkëta. As webi dhe as aplikacioni mobil nuk lidhen drejtpërdrejt me databazën.</w:t>
       </w:r>
     </w:p>
     <w:tbl>
@@ -4603,20 +4788,1552 @@
     <w:p>
       <w:pPr>
         <w:pStyle w:val="Heading1"/>
+        <w:pageBreakBefore/>
       </w:pPr>
       <w:r>
-        <w:lastRenderedPageBreak/>
-        <w:t>14. Përfundim</w:t>
+        <w:t>14. Zgjerimi i planifikuar: webfaqja dhe aplikacioni mobil</w:t>
+      </w:r>
+    </w:p>
+    <w:p>
+      <w:pPr/>
+      <w:r>
+        <w:t>Qëllimi është që Gym Management të ketë një webfaqe publike për prezantimin e palestrës, panel të sigurt për stafin dhe aplikacion mobil për anëtarët. Të tria ndërfaqet përdorin të njëjtin backend PHP dhe të njëjtën databazë MySQL, nëpërmjet faqeve web ose API-së. Kështu, një pagesë dhe abonim i regjistruar nga punonjësja bëhet i dukshëm në llogarinë përkatëse të anëtarit.</w:t>
+      </w:r>
+    </w:p>
+    <w:p>
+      <w:pPr>
+        <w:pStyle w:val="Heading2"/>
+      </w:pPr>
+      <w:r>
+        <w:t>14.1 Ndërfaqet dhe rolet</w:t>
+      </w:r>
+    </w:p>
+    <w:tbl>
+      <w:tblPr>
+        <w:tblStyle w:val="TableGrid"/>
+        <w:tblW w:type="auto" w:w="0"/>
+        <w:tblLook w:firstColumn="1" w:firstRow="1" w:lastColumn="0" w:lastRow="0" w:noHBand="0" w:noVBand="1" w:val="04A0"/>
+      </w:tblPr>
+      <w:tblGrid>
+        <w:gridCol w:w="3264"/>
+        <w:gridCol w:w="3264"/>
+        <w:gridCol w:w="3264"/>
+      </w:tblGrid>
+      <w:tr>
+        <w:tc>
+          <w:tcPr>
+            <w:tcW w:type="dxa" w:w="3264"/>
+          </w:tcPr>
+          <w:p>
+            <w:r>
+              <w:t>Ndërfaqja</w:t>
+            </w:r>
+          </w:p>
+        </w:tc>
+        <w:tc>
+          <w:tcPr>
+            <w:tcW w:type="dxa" w:w="3264"/>
+          </w:tcPr>
+          <w:p>
+            <w:r>
+              <w:t>Përdoruesit</w:t>
+            </w:r>
+          </w:p>
+        </w:tc>
+        <w:tc>
+          <w:tcPr>
+            <w:tcW w:type="dxa" w:w="3264"/>
+          </w:tcPr>
+          <w:p>
+            <w:r>
+              <w:t>Funksionet kryesore</w:t>
+            </w:r>
+          </w:p>
+        </w:tc>
+      </w:tr>
+      <w:tr>
+        <w:tc>
+          <w:tcPr>
+            <w:tcW w:type="dxa" w:w="3264"/>
+          </w:tcPr>
+          <w:p>
+            <w:r>
+              <w:t>Webfaqja publike (/)</w:t>
+            </w:r>
+          </w:p>
+        </w:tc>
+        <w:tc>
+          <w:tcPr>
+            <w:tcW w:type="dxa" w:w="3264"/>
+          </w:tcPr>
+          <w:p>
+            <w:r>
+              <w:t>Vizitorët</w:t>
+            </w:r>
+          </w:p>
+        </w:tc>
+        <w:tc>
+          <w:tcPr>
+            <w:tcW w:type="dxa" w:w="3264"/>
+          </w:tcPr>
+          <w:p>
+            <w:r>
+              <w:t>Përshkrimi i palestrës, shërbimet, planet/çmimet, orari dhe kontaktet; nuk shfaq të dhëna private.</w:t>
+            </w:r>
+          </w:p>
+        </w:tc>
+      </w:tr>
+      <w:tr>
+        <w:tc>
+          <w:tcPr>
+            <w:tcW w:type="dxa" w:w="3264"/>
+          </w:tcPr>
+          <w:p>
+            <w:r>
+              <w:t>Paneli i stafit (/admin)</w:t>
+            </w:r>
+          </w:p>
+        </w:tc>
+        <w:tc>
+          <w:tcPr>
+            <w:tcW w:type="dxa" w:w="3264"/>
+          </w:tcPr>
+          <w:p>
+            <w:r>
+              <w:t>Administratori, menaxheri/recepsionisti dhe rolet e lejuara</w:t>
+            </w:r>
+          </w:p>
+        </w:tc>
+        <w:tc>
+          <w:tcPr>
+            <w:tcW w:type="dxa" w:w="3264"/>
+          </w:tcPr>
+          <w:p>
+            <w:r>
+              <w:t>Regjistrimi i anëtarëve, llogarive, abonimeve dhe pagesave; raportet; skanimi i QR-së dhe regjistrimi i hyrjeve.</w:t>
+            </w:r>
+          </w:p>
+        </w:tc>
+      </w:tr>
+      <w:tr>
+        <w:tc>
+          <w:tcPr>
+            <w:tcW w:type="dxa" w:w="3264"/>
+          </w:tcPr>
+          <w:p>
+            <w:r>
+              <w:t>Aplikacioni React Native</w:t>
+            </w:r>
+          </w:p>
+        </w:tc>
+        <w:tc>
+          <w:tcPr>
+            <w:tcW w:type="dxa" w:w="3264"/>
+          </w:tcPr>
+          <w:p>
+            <w:r>
+              <w:t>Anëtarët</w:t>
+            </w:r>
+          </w:p>
+        </w:tc>
+        <w:tc>
+          <w:tcPr>
+            <w:tcW w:type="dxa" w:w="3264"/>
+          </w:tcPr>
+          <w:p>
+            <w:r>
+              <w:t>Kyçje, abonimi dhe afati, historiku personal i pagesave dhe hyrjeve, si dhe QR personale për hyrje.</w:t>
+            </w:r>
+          </w:p>
+        </w:tc>
+      </w:tr>
+      <w:tr>
+        <w:tc>
+          <w:tcPr>
+            <w:tcW w:type="dxa" w:w="3264"/>
+          </w:tcPr>
+          <w:p>
+            <w:r>
+              <w:t>Faqja e demonstrimit (/qr-test)</w:t>
+            </w:r>
+          </w:p>
+        </w:tc>
+        <w:tc>
+          <w:tcPr>
+            <w:tcW w:type="dxa" w:w="3264"/>
+          </w:tcPr>
+          <w:p>
+            <w:r>
+              <w:t>Llogaritë testuese të autorizuara</w:t>
+            </w:r>
+          </w:p>
+        </w:tc>
+        <w:tc>
+          <w:tcPr>
+            <w:tcW w:type="dxa" w:w="3264"/>
+          </w:tcPr>
+          <w:p>
+            <w:r>
+              <w:t>Shfaq QR-në e përdoruesit testues të kyçur dhe lejon demonstrimin e skanimit; përdor të dhëna testuese, jo anëtarësime reale.</w:t>
+            </w:r>
+          </w:p>
+        </w:tc>
+      </w:tr>
+    </w:tbl>
+    <w:p>
+      <w:pPr/>
+      <w:r>
+        <w:t>Faqja /qr-test është e ndarë nga faqja publike për qëllime demonstrimi, por nuk duhet të lejojë zgjedhjen e identitetit të një anëtari tjetër. Çdo llogari e kyçur sheh vetëm QR-në e vet. Ambienti i testimit duhet të përdorë databazë dhe llogari të veçanta nga sistemi real; ndarja e testimit nuk anashkalon autentikimin.</w:t>
+      </w:r>
+    </w:p>
+    <w:p>
+      <w:pPr>
+        <w:pStyle w:val="Heading1"/>
+      </w:pPr>
+      <w:r>
+        <w:t>15. Arkitektura e integrimit</w:t>
+      </w:r>
+    </w:p>
+    <w:p>
+      <w:pPr/>
+      <w:r>
+        <w:t>Aplikacioni React Native komunikon me API-në REST të PHP-së përmes HTTPS dhe të dhënave JSON. PHP verifikon tokenin, rolin, pronësinë e të dhënave dhe rregullat e abonimit; vetëm backend-i lidhet me MySQL përmes PDO/prepared statements. Webfaqja përdor të njëjtën logjikë biznesi. Aplikacioni mobil nuk përmban kredenciale të databazës dhe nuk lidhet drejtpërdrejt me MySQL.</w:t>
+      </w:r>
+    </w:p>
+    <w:tbl>
+      <w:tblPr>
+        <w:tblStyle w:val="TableGrid"/>
+        <w:tblW w:type="auto" w:w="0"/>
+        <w:tblLook w:firstColumn="1" w:firstRow="1" w:lastColumn="0" w:lastRow="0" w:noHBand="0" w:noVBand="1" w:val="04A0"/>
+      </w:tblPr>
+      <w:tblGrid>
+        <w:gridCol w:w="4896"/>
+        <w:gridCol w:w="4896"/>
+      </w:tblGrid>
+      <w:tr>
+        <w:tc>
+          <w:tcPr>
+            <w:tcW w:type="dxa" w:w="4896"/>
+          </w:tcPr>
+          <w:p>
+            <w:r>
+              <w:t>Komponenti</w:t>
+            </w:r>
+          </w:p>
+        </w:tc>
+        <w:tc>
+          <w:tcPr>
+            <w:tcW w:type="dxa" w:w="4896"/>
+          </w:tcPr>
+          <w:p>
+            <w:r>
+              <w:t>Përgjegjësia</w:t>
+            </w:r>
+          </w:p>
+        </w:tc>
+      </w:tr>
+      <w:tr>
+        <w:tc>
+          <w:tcPr>
+            <w:tcW w:type="dxa" w:w="4896"/>
+          </w:tcPr>
+          <w:p>
+            <w:r>
+              <w:t>Web publik dhe paneli PHP</w:t>
+            </w:r>
+          </w:p>
+        </w:tc>
+        <w:tc>
+          <w:tcPr>
+            <w:tcW w:type="dxa" w:w="4896"/>
+          </w:tcPr>
+          <w:p>
+            <w:r>
+              <w:t>Faqet publike, paneli i stafit, sesionet e sigurta dhe veprimet administrative.</w:t>
+            </w:r>
+          </w:p>
+        </w:tc>
+      </w:tr>
+      <w:tr>
+        <w:tc>
+          <w:tcPr>
+            <w:tcW w:type="dxa" w:w="4896"/>
+          </w:tcPr>
+          <w:p>
+            <w:r>
+              <w:t>API REST/JSON në PHP</w:t>
+            </w:r>
+          </w:p>
+        </w:tc>
+        <w:tc>
+          <w:tcPr>
+            <w:tcW w:type="dxa" w:w="4896"/>
+          </w:tcPr>
+          <w:p>
+            <w:r>
+              <w:t>Autentikimi mobil, verifikimi i roleve, lexim/përditësim i të dhënave të lejuara dhe kontrolli i QR-së.</w:t>
+            </w:r>
+          </w:p>
+        </w:tc>
+      </w:tr>
+      <w:tr>
+        <w:tc>
+          <w:tcPr>
+            <w:tcW w:type="dxa" w:w="4896"/>
+          </w:tcPr>
+          <w:p>
+            <w:r>
+              <w:t>MySQL</w:t>
+            </w:r>
+          </w:p>
+        </w:tc>
+        <w:tc>
+          <w:tcPr>
+            <w:tcW w:type="dxa" w:w="4896"/>
+          </w:tcPr>
+          <w:p>
+            <w:r>
+              <w:t>Ruajtja e përbashkët e llogarive, anëtarëve, abonimeve, pagesave, tokenëve QR dhe hyrjeve.</w:t>
+            </w:r>
+          </w:p>
+        </w:tc>
+      </w:tr>
+      <w:tr>
+        <w:tc>
+          <w:tcPr>
+            <w:tcW w:type="dxa" w:w="4896"/>
+          </w:tcPr>
+          <w:p>
+            <w:r>
+              <w:t>Aplikacioni React Native</w:t>
+            </w:r>
+          </w:p>
+        </w:tc>
+        <w:tc>
+          <w:tcPr>
+            <w:tcW w:type="dxa" w:w="4896"/>
+          </w:tcPr>
+          <w:p>
+            <w:r>
+              <w:t>Ndërfaqja mobile; komunikon vetëm me endpoint-et e autorizuara të API-së.</w:t>
+            </w:r>
+          </w:p>
+        </w:tc>
+      </w:tr>
+    </w:tbl>
+    <w:p>
+      <w:pPr/>
+      <w:r>
+        <w:t>Endpoint-et e mëposhtme janë shembuj planifikimi, jo implementim i përfunduar: POST /api/v1/auth/login; GET /api/v1/members/me; GET /api/v1/memberships/me; GET /api/v1/payments/me; POST /api/v1/qr/token; POST /api/v1/check-ins/verify. API-ja duhet të kthejë vetëm të dhënat që i takojnë përdoruesit të autentikuar.</w:t>
+      </w:r>
+    </w:p>
+    <w:p>
+      <w:pPr>
+        <w:pStyle w:val="Heading1"/>
+      </w:pPr>
+      <w:r>
+        <w:t>16. Rrjedha e regjistrimit, pagesës dhe hyrjes</w:t>
+      </w:r>
+    </w:p>
+    <w:p>
+      <w:pPr>
+        <w:pStyle w:val="Heading2"/>
+      </w:pPr>
+      <w:r>
+        <w:t>16.1 Regjistrimi dhe aktivizimi i anëtarit</w:t>
+      </w:r>
+    </w:p>
+    <w:tbl>
+      <w:tblPr>
+        <w:tblStyle w:val="TableGrid"/>
+        <w:tblW w:type="auto" w:w="0"/>
+        <w:tblLook w:firstColumn="1" w:firstRow="1" w:lastColumn="0" w:lastRow="0" w:noHBand="0" w:noVBand="1" w:val="04A0"/>
+      </w:tblPr>
+      <w:tblGrid>
+        <w:gridCol w:w="4896"/>
+        <w:gridCol w:w="4896"/>
+      </w:tblGrid>
+      <w:tr>
+        <w:tc>
+          <w:tcPr>
+            <w:tcW w:type="dxa" w:w="4896"/>
+          </w:tcPr>
+          <w:p>
+            <w:r>
+              <w:t>Hapi</w:t>
+            </w:r>
+          </w:p>
+        </w:tc>
+        <w:tc>
+          <w:tcPr>
+            <w:tcW w:type="dxa" w:w="4896"/>
+          </w:tcPr>
+          <w:p>
+            <w:r>
+              <w:t>Veprimi dhe rregulli</w:t>
+            </w:r>
+          </w:p>
+        </w:tc>
+      </w:tr>
+      <w:tr>
+        <w:tc>
+          <w:tcPr>
+            <w:tcW w:type="dxa" w:w="4896"/>
+          </w:tcPr>
+          <w:p>
+            <w:r>
+              <w:t>1</w:t>
+            </w:r>
+          </w:p>
+        </w:tc>
+        <w:tc>
+          <w:tcPr>
+            <w:tcW w:type="dxa" w:w="4896"/>
+          </w:tcPr>
+          <w:p>
+            <w:r>
+              <w:t>Punonjësja kërkon anëtarin ekzistues ose regjistron anëtar të ri nga paneli; emaili unik përdoret për lidhjen e llogarisë.</w:t>
+            </w:r>
+          </w:p>
+        </w:tc>
+      </w:tr>
+      <w:tr>
+        <w:tc>
+          <w:tcPr>
+            <w:tcW w:type="dxa" w:w="4896"/>
+          </w:tcPr>
+          <w:p>
+            <w:r>
+              <w:t>2</w:t>
+            </w:r>
+          </w:p>
+        </w:tc>
+        <w:tc>
+          <w:tcPr>
+            <w:tcW w:type="dxa" w:w="4896"/>
+          </w:tcPr>
+          <w:p>
+            <w:r>
+              <w:t>Sistemi krijon/aktivizon llogarinë me rolin member dhe e lidh me rekordin members; klienti cakton fjalëkalimin përmes rrjedhës së sigurt të ftesës ose rivendosjes.</w:t>
+            </w:r>
+          </w:p>
+        </w:tc>
+      </w:tr>
+      <w:tr>
+        <w:tc>
+          <w:tcPr>
+            <w:tcW w:type="dxa" w:w="4896"/>
+          </w:tcPr>
+          <w:p>
+            <w:r>
+              <w:t>3</w:t>
+            </w:r>
+          </w:p>
+        </w:tc>
+        <w:tc>
+          <w:tcPr>
+            <w:tcW w:type="dxa" w:w="4896"/>
+          </w:tcPr>
+          <w:p>
+            <w:r>
+              <w:t>Punonjësja zgjedh planin njëvjeçar dhe datat, regjistron pagesën e konfirmuar dhe e lidh atë me abonimin. Krijimi i abonimit dhe pagesës ruhet në një transaksion databaze.</w:t>
+            </w:r>
+          </w:p>
+        </w:tc>
+      </w:tr>
+      <w:tr>
+        <w:tc>
+          <w:tcPr>
+            <w:tcW w:type="dxa" w:w="4896"/>
+          </w:tcPr>
+          <w:p>
+            <w:r>
+              <w:t>4</w:t>
+            </w:r>
+          </w:p>
+        </w:tc>
+        <w:tc>
+          <w:tcPr>
+            <w:tcW w:type="dxa" w:w="4896"/>
+          </w:tcPr>
+          <w:p>
+            <w:r>
+              <w:t>Abonimi lejon hyrjen vetëm kur është brenda datave të vlefshmërisë dhe shuma e pagesave të suksesshme mbulon çmimin e plotë të planit. Pagesat e pjesshme/papaguara nuk japin qasje.</w:t>
+            </w:r>
+          </w:p>
+        </w:tc>
+      </w:tr>
+      <w:tr>
+        <w:tc>
+          <w:tcPr>
+            <w:tcW w:type="dxa" w:w="4896"/>
+          </w:tcPr>
+          <w:p>
+            <w:r>
+              <w:t>5</w:t>
+            </w:r>
+          </w:p>
+        </w:tc>
+        <w:tc>
+          <w:tcPr>
+            <w:tcW w:type="dxa" w:w="4896"/>
+          </w:tcPr>
+          <w:p>
+            <w:r>
+              <w:t>Anëtari kyçet në aplikacionin mobil dhe sheh statusin, datën e skadimit, pagesat dhe hyrjet e veta.</w:t>
+            </w:r>
+          </w:p>
+        </w:tc>
+      </w:tr>
+    </w:tbl>
+    <w:p>
+      <w:pPr/>
+      <w:r>
+        <w:t>Për pagesa në recepsion, punonjësja shënon pagesën vetëm pasi ta ketë konfirmuar pranimin e saj. Pagesat online nuk përfshihen në këtë plan fillestar; integrimi me ofrues pagesash mund të shtohet më vonë.</w:t>
+      </w:r>
+    </w:p>
+    <w:p>
+      <w:pPr>
+        <w:pStyle w:val="Heading2"/>
+      </w:pPr>
+      <w:r>
+        <w:t>16.2 QR dhe kontrolli i hyrjes</w:t>
+      </w:r>
+    </w:p>
+    <w:tbl>
+      <w:tblPr>
+        <w:tblStyle w:val="TableGrid"/>
+        <w:tblW w:type="auto" w:w="0"/>
+        <w:tblLook w:firstColumn="1" w:firstRow="1" w:lastColumn="0" w:lastRow="0" w:noHBand="0" w:noVBand="1" w:val="04A0"/>
+      </w:tblPr>
+      <w:tblGrid>
+        <w:gridCol w:w="4896"/>
+        <w:gridCol w:w="4896"/>
+      </w:tblGrid>
+      <w:tr>
+        <w:tc>
+          <w:tcPr>
+            <w:tcW w:type="dxa" w:w="4896"/>
+          </w:tcPr>
+          <w:p>
+            <w:r>
+              <w:t>Hapi</w:t>
+            </w:r>
+          </w:p>
+        </w:tc>
+        <w:tc>
+          <w:tcPr>
+            <w:tcW w:type="dxa" w:w="4896"/>
+          </w:tcPr>
+          <w:p>
+            <w:r>
+              <w:t>Veprimi dhe kontrolli</w:t>
+            </w:r>
+          </w:p>
+        </w:tc>
+      </w:tr>
+      <w:tr>
+        <w:tc>
+          <w:tcPr>
+            <w:tcW w:type="dxa" w:w="4896"/>
+          </w:tcPr>
+          <w:p>
+            <w:r>
+              <w:t>1</w:t>
+            </w:r>
+          </w:p>
+        </w:tc>
+        <w:tc>
+          <w:tcPr>
+            <w:tcW w:type="dxa" w:w="4896"/>
+          </w:tcPr>
+          <w:p>
+            <w:r>
+              <w:t>Anëtari i kyçur hap QR-në e vet në aplikacion ose në faqen e mbrojtur të demonstrimit.</w:t>
+            </w:r>
+          </w:p>
+        </w:tc>
+      </w:tr>
+      <w:tr>
+        <w:tc>
+          <w:tcPr>
+            <w:tcW w:type="dxa" w:w="4896"/>
+          </w:tcPr>
+          <w:p>
+            <w:r>
+              <w:t>2</w:t>
+            </w:r>
+          </w:p>
+        </w:tc>
+        <w:tc>
+          <w:tcPr>
+            <w:tcW w:type="dxa" w:w="4896"/>
+          </w:tcPr>
+          <w:p>
+            <w:r>
+              <w:t>Skaneri i stafit, i hapur në telefon ose pajisje tjetër, lexon tokenin e përkohshëm dhe ia dërgon API-së përmes HTTPS.</w:t>
+            </w:r>
+          </w:p>
+        </w:tc>
+      </w:tr>
+      <w:tr>
+        <w:tc>
+          <w:tcPr>
+            <w:tcW w:type="dxa" w:w="4896"/>
+          </w:tcPr>
+          <w:p>
+            <w:r>
+              <w:t>3</w:t>
+            </w:r>
+          </w:p>
+        </w:tc>
+        <w:tc>
+          <w:tcPr>
+            <w:tcW w:type="dxa" w:w="4896"/>
+          </w:tcPr>
+          <w:p>
+            <w:r>
+              <w:t>Serveri kontrollon tokenin, afatin dhe përdorimin e tij, identitetin e anëtarit, statusin aktiv, datat e abonimit dhe pagesën e plotë.</w:t>
+            </w:r>
+          </w:p>
+        </w:tc>
+      </w:tr>
+      <w:tr>
+        <w:tc>
+          <w:tcPr>
+            <w:tcW w:type="dxa" w:w="4896"/>
+          </w:tcPr>
+          <w:p>
+            <w:r>
+              <w:t>4</w:t>
+            </w:r>
+          </w:p>
+        </w:tc>
+        <w:tc>
+          <w:tcPr>
+            <w:tcW w:type="dxa" w:w="4896"/>
+          </w:tcPr>
+          <w:p>
+            <w:r>
+              <w:t>Nëse të gjitha kontrollet kalojnë, tokeni konsumohet dhe krijohet hyrja në historik; përndryshe hyrja refuzohet dhe regjistrohet arsyeja.</w:t>
+            </w:r>
+          </w:p>
+        </w:tc>
+      </w:tr>
+    </w:tbl>
+    <w:p>
+      <w:pPr/>
+      <w:r>
+        <w:t>QR-ja nuk duhet të përmbajë emër, email ose ID të parashikueshme dhe nuk duhet të jetë kod statik i ripërdorshëm. Rekomandohet token rastësor me jetë të shkurtër, përdorim njëherësh dhe ruajtje vetëm e hash-it në server. Verifikimi kërkon lidhje interneti; kodi i vlefshëm nuk zëvendëson kontrollin e serverit. Automatizimi fizik i derës/RFID është fazë e veçantë dhe nuk përfshihet këtu.</w:t>
+      </w:r>
+    </w:p>
+    <w:p>
+      <w:pPr>
+        <w:pStyle w:val="Heading1"/>
+      </w:pPr>
+      <w:r>
+        <w:t>17. Zgjerimet e modelit të databazës</w:t>
+      </w:r>
+    </w:p>
+    <w:p>
+      <w:pPr/>
+      <w:r>
+        <w:t>Modeli ekzistues zgjerohet në mënyrë minimale për llogaritë e anëtarëve dhe auditimin e hyrjeve. Të gjitha lidhjet përdorin foreign keys dhe indekse sipas kërkimeve të zakonshme.</w:t>
+      </w:r>
+    </w:p>
+    <w:tbl>
+      <w:tblPr>
+        <w:tblStyle w:val="TableGrid"/>
+        <w:tblW w:type="auto" w:w="0"/>
+        <w:tblLook w:firstColumn="1" w:firstRow="1" w:lastColumn="0" w:lastRow="0" w:noHBand="0" w:noVBand="1" w:val="04A0"/>
+      </w:tblPr>
+      <w:tblGrid>
+        <w:gridCol w:w="3264"/>
+        <w:gridCol w:w="3264"/>
+        <w:gridCol w:w="3264"/>
+      </w:tblGrid>
+      <w:tr>
+        <w:tc>
+          <w:tcPr>
+            <w:tcW w:type="dxa" w:w="3264"/>
+          </w:tcPr>
+          <w:p>
+            <w:r>
+              <w:t>Tabela/fusha</w:t>
+            </w:r>
+          </w:p>
+        </w:tc>
+        <w:tc>
+          <w:tcPr>
+            <w:tcW w:type="dxa" w:w="3264"/>
+          </w:tcPr>
+          <w:p>
+            <w:r>
+              <w:t>Zgjerimi i propozuar</w:t>
+            </w:r>
+          </w:p>
+        </w:tc>
+        <w:tc>
+          <w:tcPr>
+            <w:tcW w:type="dxa" w:w="3264"/>
+          </w:tcPr>
+          <w:p>
+            <w:r>
+              <w:t>Rregulli</w:t>
+            </w:r>
+          </w:p>
+        </w:tc>
+      </w:tr>
+      <w:tr>
+        <w:tc>
+          <w:tcPr>
+            <w:tcW w:type="dxa" w:w="3264"/>
+          </w:tcPr>
+          <w:p>
+            <w:r>
+              <w:t>users</w:t>
+            </w:r>
+          </w:p>
+        </w:tc>
+        <w:tc>
+          <w:tcPr>
+            <w:tcW w:type="dxa" w:w="3264"/>
+          </w:tcPr>
+          <w:p>
+            <w:r>
+              <w:t>Përdoret për llogaritë e stafit dhe anëtarëve; role të ndara admin, manager/receptionist, trainer dhe member.</w:t>
+            </w:r>
+          </w:p>
+        </w:tc>
+        <w:tc>
+          <w:tcPr>
+            <w:tcW w:type="dxa" w:w="3264"/>
+          </w:tcPr>
+          <w:p>
+            <w:r>
+              <w:t>Email unik; fjalëkalim vetëm si hash; llogari aktive/joaktive.</w:t>
+            </w:r>
+          </w:p>
+        </w:tc>
+      </w:tr>
+      <w:tr>
+        <w:tc>
+          <w:tcPr>
+            <w:tcW w:type="dxa" w:w="3264"/>
+          </w:tcPr>
+          <w:p>
+            <w:r>
+              <w:t>members</w:t>
+            </w:r>
+          </w:p>
+        </w:tc>
+        <w:tc>
+          <w:tcPr>
+            <w:tcW w:type="dxa" w:w="3264"/>
+          </w:tcPr>
+          <w:p>
+            <w:r>
+              <w:t>Shto user_id nullable dhe UNIQUE, FK te users.user_id.</w:t>
+            </w:r>
+          </w:p>
+        </w:tc>
+        <w:tc>
+          <w:tcPr>
+            <w:tcW w:type="dxa" w:w="3264"/>
+          </w:tcPr>
+          <w:p>
+            <w:r>
+              <w:t>Lidhje opsionale para aktivizimit të portalit; një llogari anëtari lidhet me vetëm një profil.</w:t>
+            </w:r>
+          </w:p>
+        </w:tc>
+      </w:tr>
+      <w:tr>
+        <w:tc>
+          <w:tcPr>
+            <w:tcW w:type="dxa" w:w="3264"/>
+          </w:tcPr>
+          <w:p>
+            <w:r>
+              <w:t>qr_tokens</w:t>
+            </w:r>
+          </w:p>
+        </w:tc>
+        <w:tc>
+          <w:tcPr>
+            <w:tcW w:type="dxa" w:w="3264"/>
+          </w:tcPr>
+          <w:p>
+            <w:r>
+              <w:t>token_id, member_id, token_hash, expires_at, used_at, revoked_at, created_at.</w:t>
+            </w:r>
+          </w:p>
+        </w:tc>
+        <w:tc>
+          <w:tcPr>
+            <w:tcW w:type="dxa" w:w="3264"/>
+          </w:tcPr>
+          <w:p>
+            <w:r>
+              <w:t>Ruhet hash-i, jo kodi i lexueshëm; tokeni skadon dhe nuk përdoret dy herë.</w:t>
+            </w:r>
+          </w:p>
+        </w:tc>
+      </w:tr>
+      <w:tr>
+        <w:tc>
+          <w:tcPr>
+            <w:tcW w:type="dxa" w:w="3264"/>
+          </w:tcPr>
+          <w:p>
+            <w:r>
+              <w:t>check_ins</w:t>
+            </w:r>
+          </w:p>
+        </w:tc>
+        <w:tc>
+          <w:tcPr>
+            <w:tcW w:type="dxa" w:w="3264"/>
+          </w:tcPr>
+          <w:p>
+            <w:r>
+              <w:t>check_in_id, member_id, membership_id, checked_at, result, reason, scanned_by.</w:t>
+            </w:r>
+          </w:p>
+        </w:tc>
+        <w:tc>
+          <w:tcPr>
+            <w:tcW w:type="dxa" w:w="3264"/>
+          </w:tcPr>
+          <w:p>
+            <w:r>
+              <w:t>Ruhet çdo tentativë/hyrje, rezultati dhe punonjësi që skanoi; historiku nuk fshihet me çaktivizimin e anëtarit.</w:t>
+            </w:r>
+          </w:p>
+        </w:tc>
+      </w:tr>
+    </w:tbl>
+    <w:p>
+      <w:pPr/>
+      <w:r>
+        <w:t>Relacionet e reja: users 1:0..1 members për llogarinë mobile; members 1:N qr_tokens dhe members 1:N check_ins; memberships 1:N check_ins; users 1:N check_ins si scanned_by për punonjësin skanues. Tokenët e skaduar mund të pastrohen sipas politikës së ruajtjes, ndërsa historiku i hyrjeve mbahet për raportim/auditim.</w:t>
+      </w:r>
+    </w:p>
+    <w:p>
+      <w:pPr>
+        <w:pStyle w:val="Heading1"/>
+      </w:pPr>
+      <w:r>
+        <w:t>18. Siguria dhe kërkesat shtesë</w:t>
+      </w:r>
+    </w:p>
+    <w:p>
+      <w:pPr/>
+      <w:r>
+        <w:t>Përveç kërkesave të sigurisë në këtë raport, zgjerimi web/mobile duhet të respektojë këto pika:</w:t>
+      </w:r>
+    </w:p>
+    <w:tbl>
+      <w:tblPr>
+        <w:tblStyle w:val="TableGrid"/>
+        <w:tblW w:type="auto" w:w="0"/>
+        <w:tblLook w:firstColumn="1" w:firstRow="1" w:lastColumn="0" w:lastRow="0" w:noHBand="0" w:noVBand="1" w:val="04A0"/>
+      </w:tblPr>
+      <w:tblGrid>
+        <w:gridCol w:w="3264"/>
+        <w:gridCol w:w="3264"/>
+        <w:gridCol w:w="3264"/>
+      </w:tblGrid>
+      <w:tr>
+        <w:tc>
+          <w:tcPr>
+            <w:tcW w:type="dxa" w:w="3264"/>
+          </w:tcPr>
+          <w:p>
+            <w:r>
+              <w:t>ID</w:t>
+            </w:r>
+          </w:p>
+        </w:tc>
+        <w:tc>
+          <w:tcPr>
+            <w:tcW w:type="dxa" w:w="3264"/>
+          </w:tcPr>
+          <w:p>
+            <w:r>
+              <w:t>Kërkesa e testueshme</w:t>
+            </w:r>
+          </w:p>
+        </w:tc>
+        <w:tc>
+          <w:tcPr>
+            <w:tcW w:type="dxa" w:w="3264"/>
+          </w:tcPr>
+          <w:p>
+            <w:r>
+              <w:t>Kriteri i pranimit</w:t>
+            </w:r>
+          </w:p>
+        </w:tc>
+      </w:tr>
+      <w:tr>
+        <w:tc>
+          <w:tcPr>
+            <w:tcW w:type="dxa" w:w="3264"/>
+          </w:tcPr>
+          <w:p>
+            <w:r>
+              <w:t>KJ-09</w:t>
+            </w:r>
+          </w:p>
+        </w:tc>
+        <w:tc>
+          <w:tcPr>
+            <w:tcW w:type="dxa" w:w="3264"/>
+          </w:tcPr>
+          <w:p>
+            <w:r>
+              <w:t>Webi dhe aplikacioni mobil përdorin të njëjtën API dhe të njëjtën burim të të dhënave.</w:t>
+            </w:r>
+          </w:p>
+        </w:tc>
+        <w:tc>
+          <w:tcPr>
+            <w:tcW w:type="dxa" w:w="3264"/>
+          </w:tcPr>
+          <w:p>
+            <w:r>
+              <w:t>Një pagesë e regjistruar në panel shfaqet në historikun e llogarisë përkatëse pas rifreskimit.</w:t>
+            </w:r>
+          </w:p>
+        </w:tc>
+      </w:tr>
+      <w:tr>
+        <w:tc>
+          <w:tcPr>
+            <w:tcW w:type="dxa" w:w="3264"/>
+          </w:tcPr>
+          <w:p>
+            <w:r>
+              <w:t>KJ-10</w:t>
+            </w:r>
+          </w:p>
+        </w:tc>
+        <w:tc>
+          <w:tcPr>
+            <w:tcW w:type="dxa" w:w="3264"/>
+          </w:tcPr>
+          <w:p>
+            <w:r>
+              <w:t>Anëtari mund të lexojë vetëm profilin, abonimet, pagesat dhe hyrjet e veta.</w:t>
+            </w:r>
+          </w:p>
+        </w:tc>
+        <w:tc>
+          <w:tcPr>
+            <w:tcW w:type="dxa" w:w="3264"/>
+          </w:tcPr>
+          <w:p>
+            <w:r>
+              <w:t>Kërkesa me identifikues të një anëtari tjetër refuzohet nga backend-i.</w:t>
+            </w:r>
+          </w:p>
+        </w:tc>
+      </w:tr>
+      <w:tr>
+        <w:tc>
+          <w:tcPr>
+            <w:tcW w:type="dxa" w:w="3264"/>
+          </w:tcPr>
+          <w:p>
+            <w:r>
+              <w:t>KJ-11</w:t>
+            </w:r>
+          </w:p>
+        </w:tc>
+        <w:tc>
+          <w:tcPr>
+            <w:tcW w:type="dxa" w:w="3264"/>
+          </w:tcPr>
+          <w:p>
+            <w:r>
+              <w:t>QR-të janë të përkohshme, njëpërdorimëshe dhe verifikohen online.</w:t>
+            </w:r>
+          </w:p>
+        </w:tc>
+        <w:tc>
+          <w:tcPr>
+            <w:tcW w:type="dxa" w:w="3264"/>
+          </w:tcPr>
+          <w:p>
+            <w:r>
+              <w:t>QR e skaduar, e përdorur ose e ndryshuar refuzohet; skanimi i vlefshëm regjistrohet vetëm një herë.</w:t>
+            </w:r>
+          </w:p>
+        </w:tc>
+      </w:tr>
+      <w:tr>
+        <w:tc>
+          <w:tcPr>
+            <w:tcW w:type="dxa" w:w="3264"/>
+          </w:tcPr>
+          <w:p>
+            <w:r>
+              <w:t>KJ-12</w:t>
+            </w:r>
+          </w:p>
+        </w:tc>
+        <w:tc>
+          <w:tcPr>
+            <w:tcW w:type="dxa" w:w="3264"/>
+          </w:tcPr>
+          <w:p>
+            <w:r>
+              <w:t>Verifikimi i hyrjes kontrollon pagesën e plotë dhe datat e abonimit në server.</w:t>
+            </w:r>
+          </w:p>
+        </w:tc>
+        <w:tc>
+          <w:tcPr>
+            <w:tcW w:type="dxa" w:w="3264"/>
+          </w:tcPr>
+          <w:p>
+            <w:r>
+              <w:t>Abonimi i skaduar, i papaguar ose pjesërisht i paguar nuk lejon hyrje.</w:t>
+            </w:r>
+          </w:p>
+        </w:tc>
+      </w:tr>
+      <w:tr>
+        <w:tc>
+          <w:tcPr>
+            <w:tcW w:type="dxa" w:w="3264"/>
+          </w:tcPr>
+          <w:p>
+            <w:r>
+              <w:t>KJ-13</w:t>
+            </w:r>
+          </w:p>
+        </w:tc>
+        <w:tc>
+          <w:tcPr>
+            <w:tcW w:type="dxa" w:w="3264"/>
+          </w:tcPr>
+          <w:p>
+            <w:r>
+              <w:t>Ambientet testuese janë të ndara nga të dhënat reale.</w:t>
+            </w:r>
+          </w:p>
+        </w:tc>
+        <w:tc>
+          <w:tcPr>
+            <w:tcW w:type="dxa" w:w="3264"/>
+          </w:tcPr>
+          <w:p>
+            <w:r>
+              <w:t>Skanimet dhe pagesat testuese nuk ndryshojnë regjistrat realë.</w:t>
+            </w:r>
+          </w:p>
+        </w:tc>
+      </w:tr>
+      <w:tr>
+        <w:tc>
+          <w:tcPr>
+            <w:tcW w:type="dxa" w:w="3264"/>
+          </w:tcPr>
+          <w:p>
+            <w:r>
+              <w:t>KJ-14</w:t>
+            </w:r>
+          </w:p>
+        </w:tc>
+        <w:tc>
+          <w:tcPr>
+            <w:tcW w:type="dxa" w:w="3264"/>
+          </w:tcPr>
+          <w:p>
+            <w:r>
+              <w:t>Sesioni mobil mund të skadojë dhe revokohet; komunikimi prodhues përdor HTTPS.</w:t>
+            </w:r>
+          </w:p>
+        </w:tc>
+        <w:tc>
+          <w:tcPr>
+            <w:tcW w:type="dxa" w:w="3264"/>
+          </w:tcPr>
+          <w:p>
+            <w:r>
+              <w:t>Token i skaduar/revokuar refuzohet dhe përdoruesi duhet të kyçet përsëri.</w:t>
+            </w:r>
+          </w:p>
+        </w:tc>
+      </w:tr>
+    </w:tbl>
+    <w:p>
+      <w:pPr>
+        <w:pStyle w:val="Heading1"/>
+      </w:pPr>
+      <w:r>
+        <w:t>19. Plani i implementimit me faza</w:t>
+      </w:r>
+    </w:p>
+    <w:tbl>
+      <w:tblPr>
+        <w:tblStyle w:val="TableGrid"/>
+        <w:tblW w:type="auto" w:w="0"/>
+        <w:tblLook w:firstColumn="1" w:firstRow="1" w:lastColumn="0" w:lastRow="0" w:noHBand="0" w:noVBand="1" w:val="04A0"/>
+      </w:tblPr>
+      <w:tblGrid>
+        <w:gridCol w:w="3264"/>
+        <w:gridCol w:w="3264"/>
+        <w:gridCol w:w="3264"/>
+      </w:tblGrid>
+      <w:tr>
+        <w:tc>
+          <w:tcPr>
+            <w:tcW w:type="dxa" w:w="3264"/>
+          </w:tcPr>
+          <w:p>
+            <w:r>
+              <w:t>Faza</w:t>
+            </w:r>
+          </w:p>
+        </w:tc>
+        <w:tc>
+          <w:tcPr>
+            <w:tcW w:type="dxa" w:w="3264"/>
+          </w:tcPr>
+          <w:p>
+            <w:r>
+              <w:t>Përmbajtja</w:t>
+            </w:r>
+          </w:p>
+        </w:tc>
+        <w:tc>
+          <w:tcPr>
+            <w:tcW w:type="dxa" w:w="3264"/>
+          </w:tcPr>
+          <w:p>
+            <w:r>
+              <w:t>Rezultati / kushti për vazhdim</w:t>
+            </w:r>
+          </w:p>
+        </w:tc>
+      </w:tr>
+      <w:tr>
+        <w:tc>
+          <w:tcPr>
+            <w:tcW w:type="dxa" w:w="3264"/>
+          </w:tcPr>
+          <w:p>
+            <w:r>
+              <w:t>1. Themelimi web</w:t>
+            </w:r>
+          </w:p>
+        </w:tc>
+        <w:tc>
+          <w:tcPr>
+            <w:tcW w:type="dxa" w:w="3264"/>
+          </w:tcPr>
+          <w:p>
+            <w:r>
+              <w:t>Databaza MySQL, autentikimi me role, paneli i stafit dhe regjistrimi i anëtarëve.</w:t>
+            </w:r>
+          </w:p>
+        </w:tc>
+        <w:tc>
+          <w:tcPr>
+            <w:tcW w:type="dxa" w:w="3264"/>
+          </w:tcPr>
+          <w:p>
+            <w:r>
+              <w:t>Stafi mund të kyçet dhe të krijojë profil anëtari.</w:t>
+            </w:r>
+          </w:p>
+        </w:tc>
+      </w:tr>
+      <w:tr>
+        <w:tc>
+          <w:tcPr>
+            <w:tcW w:type="dxa" w:w="3264"/>
+          </w:tcPr>
+          <w:p>
+            <w:r>
+              <w:t>2. Abonime dhe pagesa</w:t>
+            </w:r>
+          </w:p>
+        </w:tc>
+        <w:tc>
+          <w:tcPr>
+            <w:tcW w:type="dxa" w:w="3264"/>
+          </w:tcPr>
+          <w:p>
+            <w:r>
+              <w:t>Planet, abonimi, regjistrimi i pagesave dhe historiku; transaksione databaze.</w:t>
+            </w:r>
+          </w:p>
+        </w:tc>
+        <w:tc>
+          <w:tcPr>
+            <w:tcW w:type="dxa" w:w="3264"/>
+          </w:tcPr>
+          <w:p>
+            <w:r>
+              <w:t>Pagesa e konfirmuar dhe abonimi lidhen saktë; përcaktohet statusi valid.</w:t>
+            </w:r>
+          </w:p>
+        </w:tc>
+      </w:tr>
+      <w:tr>
+        <w:tc>
+          <w:tcPr>
+            <w:tcW w:type="dxa" w:w="3264"/>
+          </w:tcPr>
+          <w:p>
+            <w:r>
+              <w:t>3. Webfaqja publike</w:t>
+            </w:r>
+          </w:p>
+        </w:tc>
+        <w:tc>
+          <w:tcPr>
+            <w:tcW w:type="dxa" w:w="3264"/>
+          </w:tcPr>
+          <w:p>
+            <w:r>
+              <w:t>Faqja responsive për palestrën, shërbimet, planet dhe kontaktet; lidhje e sigurt te hyrja e stafit.</w:t>
+            </w:r>
+          </w:p>
+        </w:tc>
+        <w:tc>
+          <w:tcPr>
+            <w:tcW w:type="dxa" w:w="3264"/>
+          </w:tcPr>
+          <w:p>
+            <w:r>
+              <w:t>Faqet publike nuk ekspozojnë të dhëna private; paneli kërkon autentikim.</w:t>
+            </w:r>
+          </w:p>
+        </w:tc>
+      </w:tr>
+      <w:tr>
+        <w:tc>
+          <w:tcPr>
+            <w:tcW w:type="dxa" w:w="3264"/>
+          </w:tcPr>
+          <w:p>
+            <w:r>
+              <w:t>4. API dhe testet</w:t>
+            </w:r>
+          </w:p>
+        </w:tc>
+        <w:tc>
+          <w:tcPr>
+            <w:tcW w:type="dxa" w:w="3264"/>
+          </w:tcPr>
+          <w:p>
+            <w:r>
+              <w:t>API REST/JSON në PHP, autorizim sipas rolit dhe teste të endpoint-eve.</w:t>
+            </w:r>
+          </w:p>
+        </w:tc>
+        <w:tc>
+          <w:tcPr>
+            <w:tcW w:type="dxa" w:w="3264"/>
+          </w:tcPr>
+          <w:p>
+            <w:r>
+              <w:t>Anëtari merr vetëm të dhënat e veta përmes API-së.</w:t>
+            </w:r>
+          </w:p>
+        </w:tc>
+      </w:tr>
+      <w:tr>
+        <w:tc>
+          <w:tcPr>
+            <w:tcW w:type="dxa" w:w="3264"/>
+          </w:tcPr>
+          <w:p>
+            <w:r>
+              <w:t>5. Aplikacioni React Native</w:t>
+            </w:r>
+          </w:p>
+        </w:tc>
+        <w:tc>
+          <w:tcPr>
+            <w:tcW w:type="dxa" w:w="3264"/>
+          </w:tcPr>
+          <w:p>
+            <w:r>
+              <w:t>Kyçja, profili, statusi i abonimit, pagesat, hyrjet dhe gjenerimi i QR-së.</w:t>
+            </w:r>
+          </w:p>
+        </w:tc>
+        <w:tc>
+          <w:tcPr>
+            <w:tcW w:type="dxa" w:w="3264"/>
+          </w:tcPr>
+          <w:p>
+            <w:r>
+              <w:t>Të dhënat në app përputhen me panelin për të njëjtën llogari.</w:t>
+            </w:r>
+          </w:p>
+        </w:tc>
+      </w:tr>
+      <w:tr>
+        <w:tc>
+          <w:tcPr>
+            <w:tcW w:type="dxa" w:w="3264"/>
+          </w:tcPr>
+          <w:p>
+            <w:r>
+              <w:t>6. Skanimi dhe ambienti testues</w:t>
+            </w:r>
+          </w:p>
+        </w:tc>
+        <w:tc>
+          <w:tcPr>
+            <w:tcW w:type="dxa" w:w="3264"/>
+          </w:tcPr>
+          <w:p>
+            <w:r>
+              <w:t>Skaneri i stafit, verifikimi online, log-u i hyrjeve dhe instanca /qr-test me të dhëna të izoluara.</w:t>
+            </w:r>
+          </w:p>
+        </w:tc>
+        <w:tc>
+          <w:tcPr>
+            <w:tcW w:type="dxa" w:w="3264"/>
+          </w:tcPr>
+          <w:p>
+            <w:r>
+              <w:t>Testohen QR të vlefshme, të skaduara, të ripërdorura dhe anëtarësime të papaguara.</w:t>
+            </w:r>
+          </w:p>
+        </w:tc>
+      </w:tr>
+      <w:tr>
+        <w:tc>
+          <w:tcPr>
+            <w:tcW w:type="dxa" w:w="3264"/>
+          </w:tcPr>
+          <w:p>
+            <w:r>
+              <w:t>7. Publikimi</w:t>
+            </w:r>
+          </w:p>
+        </w:tc>
+        <w:tc>
+          <w:tcPr>
+            <w:tcW w:type="dxa" w:w="3264"/>
+          </w:tcPr>
+          <w:p>
+            <w:r>
+              <w:t>HTTPS, kopje rezervë, konfigurim prodhimi, udhëzues përdorimi dhe testim në pajisje reale.</w:t>
+            </w:r>
+          </w:p>
+        </w:tc>
+        <w:tc>
+          <w:tcPr>
+            <w:tcW w:type="dxa" w:w="3264"/>
+          </w:tcPr>
+          <w:p>
+            <w:r>
+              <w:t>Publikohet vetëm pas kalimit të kontrolleve të sigurisë dhe testimit të pranimit.</w:t>
+            </w:r>
+          </w:p>
+        </w:tc>
+      </w:tr>
+    </w:tbl>
+    <w:p>
+      <w:pPr>
+        <w:pStyle w:val="Heading1"/>
+      </w:pPr>
+      <w:r>
+        <w:t>20. Skenarët kryesorë të testimit</w:t>
+      </w:r>
+    </w:p>
+    <w:tbl>
+      <w:tblPr>
+        <w:tblStyle w:val="TableGrid"/>
+        <w:tblW w:type="auto" w:w="0"/>
+        <w:tblLook w:firstColumn="1" w:firstRow="1" w:lastColumn="0" w:lastRow="0" w:noHBand="0" w:noVBand="1" w:val="04A0"/>
+      </w:tblPr>
+      <w:tblGrid>
+        <w:gridCol w:w="4896"/>
+        <w:gridCol w:w="4896"/>
+      </w:tblGrid>
+      <w:tr>
+        <w:tc>
+          <w:tcPr>
+            <w:tcW w:type="dxa" w:w="4896"/>
+          </w:tcPr>
+          <w:p>
+            <w:r>
+              <w:t>Skenari</w:t>
+            </w:r>
+          </w:p>
+        </w:tc>
+        <w:tc>
+          <w:tcPr>
+            <w:tcW w:type="dxa" w:w="4896"/>
+          </w:tcPr>
+          <w:p>
+            <w:r>
+              <w:t>Rezultati i pritur</w:t>
+            </w:r>
+          </w:p>
+        </w:tc>
+      </w:tr>
+      <w:tr>
+        <w:tc>
+          <w:tcPr>
+            <w:tcW w:type="dxa" w:w="4896"/>
+          </w:tcPr>
+          <w:p>
+            <w:r>
+              <w:t>Punonjësja regjistron pagesën e plotë dhe planin njëvjeçar.</w:t>
+            </w:r>
+          </w:p>
+        </w:tc>
+        <w:tc>
+          <w:tcPr>
+            <w:tcW w:type="dxa" w:w="4896"/>
+          </w:tcPr>
+          <w:p>
+            <w:r>
+              <w:t>Anëtari dhe llogaria lidhen; abonimi aktivizohet për datat e zgjedhura; app-i shfaq të njëjtat të dhëna.</w:t>
+            </w:r>
+          </w:p>
+        </w:tc>
+      </w:tr>
+      <w:tr>
+        <w:tc>
+          <w:tcPr>
+            <w:tcW w:type="dxa" w:w="4896"/>
+          </w:tcPr>
+          <w:p>
+            <w:r>
+              <w:t>Pagesa është e pjesshme, në pritje ose abonimi ka skaduar.</w:t>
+            </w:r>
+          </w:p>
+        </w:tc>
+        <w:tc>
+          <w:tcPr>
+            <w:tcW w:type="dxa" w:w="4896"/>
+          </w:tcPr>
+          <w:p>
+            <w:r>
+              <w:t>QR refuzohet; shfaqet arsye e kuptueshme dhe nuk regjistrohet hyrje e suksesshme.</w:t>
+            </w:r>
+          </w:p>
+        </w:tc>
+      </w:tr>
+      <w:tr>
+        <w:tc>
+          <w:tcPr>
+            <w:tcW w:type="dxa" w:w="4896"/>
+          </w:tcPr>
+          <w:p>
+            <w:r>
+              <w:t>Skanimi i QR-së së vlefshme.</w:t>
+            </w:r>
+          </w:p>
+        </w:tc>
+        <w:tc>
+          <w:tcPr>
+            <w:tcW w:type="dxa" w:w="4896"/>
+          </w:tcPr>
+          <w:p>
+            <w:r>
+              <w:t>Serveri konfirmon abonimin, konsumon tokenin dhe regjistron kohën/anëtarin/punonjësin.</w:t>
+            </w:r>
+          </w:p>
+        </w:tc>
+      </w:tr>
+      <w:tr>
+        <w:tc>
+          <w:tcPr>
+            <w:tcW w:type="dxa" w:w="4896"/>
+          </w:tcPr>
+          <w:p>
+            <w:r>
+              <w:t>Skanimi i QR-së së skaduar ose i përdorur përsëri.</w:t>
+            </w:r>
+          </w:p>
+        </w:tc>
+        <w:tc>
+          <w:tcPr>
+            <w:tcW w:type="dxa" w:w="4896"/>
+          </w:tcPr>
+          <w:p>
+            <w:r>
+              <w:t>Serveri refuzon hyrjen dhe nuk krijon hyrje të suksesshme.</w:t>
+            </w:r>
+          </w:p>
+        </w:tc>
+      </w:tr>
+      <w:tr>
+        <w:tc>
+          <w:tcPr>
+            <w:tcW w:type="dxa" w:w="4896"/>
+          </w:tcPr>
+          <w:p>
+            <w:r>
+              <w:t>Llogaria e anëtarit A kërkon të dhënat e anëtarit B.</w:t>
+            </w:r>
+          </w:p>
+        </w:tc>
+        <w:tc>
+          <w:tcPr>
+            <w:tcW w:type="dxa" w:w="4896"/>
+          </w:tcPr>
+          <w:p>
+            <w:r>
+              <w:t>API-ja refuzon kërkesën pa ekspozuar të dhënat e B.</w:t>
+            </w:r>
+          </w:p>
+        </w:tc>
+      </w:tr>
+      <w:tr>
+        <w:tc>
+          <w:tcPr>
+            <w:tcW w:type="dxa" w:w="4896"/>
+          </w:tcPr>
+          <w:p>
+            <w:r>
+              <w:t>Testuesi përdor /qr-test.</w:t>
+            </w:r>
+          </w:p>
+        </w:tc>
+        <w:tc>
+          <w:tcPr>
+            <w:tcW w:type="dxa" w:w="4896"/>
+          </w:tcPr>
+          <w:p>
+            <w:r>
+              <w:t>Shfaqet vetëm QR-ja e llogarisë së kyçur dhe asnjë regjistrim real nuk ndryshohet.</w:t>
+            </w:r>
+          </w:p>
+        </w:tc>
+      </w:tr>
+    </w:tbl>
+    <w:p>
+      <w:pPr>
+        <w:pStyle w:val="Heading1"/>
+      </w:pPr>
+      <w:r>
+        <w:t>21. Përfundim</w:t>
       </w:r>
     </w:p>
     <w:p>
       <w:r>
-        <w:t>Gym Management është një projekt i përshtatshëm për praktikë profesionale sepse adreson një problem konkret dhe përfshin funksione të rëndësishme të zhvillimit web: autentikim, validim, CRUD, databazë relacionale, relacione 1:N dhe N:M, si dhe raporte. Ky raport përcakton kufijtë e versionit fillestar dhe vendos bazën teknike për implementimin gradual gjatë semestrit.</w:t>
+        <w:t>Gym Management është projekt i përshtatshëm për praktikë profesionale sepse trajton një problem konkret dhe ndërthur zhvillimin web, API-në, aplikacionin mobil dhe menaxhimin e databazës. Ky raport përcakton fazën fillestare dhe planin e zgjerimit drejt llogarisë mobile, pagesave të lidhura dhe hyrjes së verifikuar me QR.</w:t>
       </w:r>
     </w:p>
     <w:p>
       <w:r>
-        <w:t>Vendimet kryesore janë: aplikacion web me PHP, MySQL dhe Bootstrap; arkitekturë me tri shtresa; dhe databazë relacionale me entitetet users, members, membership_plans, memberships, payments, trainers, classes dhe class_bookings.</w:t>
+        <w:t>Vendimet kryesore janë: webfaqe publike dhe panel stafi me PHP, MySQL dhe Bootstrap; API REST/JSON në PHP për aplikacionin React Native; një databazë e përbashkët; dhe hyrje me QR të verifikuar nga serveri. Aplikacioni mobil dhe QR implementohen pas rrjedhës bazë web.</w:t>
       </w:r>
     </w:p>
     <w:p>
@@ -4648,14 +6365,6 @@
         <w:pStyle w:val="ListBullet"/>
       </w:pPr>
       <w:r>
-        <w:t>PHP Manual – PDO: https://www.php.net/manual/en/book.pdo.php</w:t>
-      </w:r>
-    </w:p>
-    <w:p>
-      <w:pPr>
-        <w:pStyle w:val="ListBullet"/>
-      </w:pPr>
-      <w:r>
         <w:t>MySQL 8.4 Reference Manual: https://dev.mysql.com/doc/refman/8.4/en/</w:t>
       </w:r>
     </w:p>
@@ -4665,6 +6374,14 @@
       </w:pPr>
       <w:r>
         <w:t>Bootstrap Documentation: https://getbootstrap.com/docs/</w:t>
+      </w:r>
+    </w:p>
+    <w:p>
+      <w:pPr>
+        <w:pStyle w:val="ListBullet"/>
+      </w:pPr>
+      <w:r>
+        <w:t>React Native Documentation: https://reactnative.dev/docs/getting-started</w:t>
       </w:r>
     </w:p>
     <w:p>

</xml_diff>